<commit_message>
Drop form UX hooks; open documents from DO report.
Remove typical module extensions and client confirm; keep server-only messages. Show document link in the approved-unposted transfers report.

Co-authored-by: Cursor <cursoragent@cursor.com>
</commit_message>
<xml_diff>
--- a/Extensions/нп_КонтрольПроведенияПоДО/docs/Архитектура_решения.docx
+++ b/Extensions/нп_КонтрольПроведенияПоДО/docs/Архитектура_решения.docx
@@ -470,7 +470,62 @@
                 <w:color w:val="000000"/>
                 <w:sz w:val="22"/>
               </w:rPr>
-              <w:t>Отображение статуса согласования на форме</w:t>
+              <w:t>Серверные сообщения при отказе/пересогласовании</w:t>
+            </w:r>
+          </w:p>
+        </w:tc>
+        <w:tc>
+          <w:tcPr>
+            <w:tcW w:type="dxa" w:w="4844"/>
+            <w:tcBorders>
+              <w:top w:val="single" w:sz="8" w:color="000000"/>
+              <w:left w:val="single" w:sz="8" w:color="000000"/>
+              <w:bottom w:val="single" w:sz="8" w:color="000000"/>
+              <w:right w:val="single" w:sz="8" w:color="000000"/>
+            </w:tcBorders>
+          </w:tcPr>
+          <w:p>
+            <w:pPr>
+              <w:jc w:val="left"/>
+            </w:pPr>
+            <w:r/>
+            <w:r>
+              <w:rPr>
+                <w:rFonts w:ascii="Times New Roman" w:hAnsi="Times New Roman" w:eastAsia="Times New Roman"/>
+                <w:b w:val="0"/>
+                <w:i w:val="0"/>
+                <w:color w:val="000000"/>
+                <w:sz w:val="22"/>
+              </w:rPr>
+              <w:t>Расширение типовых модулей форм; статус на форме; вопрос подтверждения</w:t>
+            </w:r>
+          </w:p>
+        </w:tc>
+      </w:tr>
+      <w:tr>
+        <w:tc>
+          <w:tcPr>
+            <w:tcW w:type="dxa" w:w="4844"/>
+            <w:tcBorders>
+              <w:top w:val="single" w:sz="8" w:color="000000"/>
+              <w:left w:val="single" w:sz="8" w:color="000000"/>
+              <w:bottom w:val="single" w:sz="8" w:color="000000"/>
+              <w:right w:val="single" w:sz="8" w:color="000000"/>
+            </w:tcBorders>
+          </w:tcPr>
+          <w:p>
+            <w:pPr>
+              <w:jc w:val="left"/>
+            </w:pPr>
+            <w:r/>
+            <w:r>
+              <w:rPr>
+                <w:rFonts w:ascii="Times New Roman" w:hAnsi="Times New Roman" w:eastAsia="Times New Roman"/>
+                <w:b w:val="0"/>
+                <w:i w:val="0"/>
+                <w:color w:val="000000"/>
+                <w:sz w:val="22"/>
+              </w:rPr>
             </w:r>
           </w:p>
         </w:tc>
@@ -586,24 +641,7 @@
           <w:color w:val="000000"/>
           <w:sz w:val="28"/>
         </w:rPr>
-        <w:t>– API ДО 3: ИнтеграцияС1СДокументооборот3 (ПрерватьОбработку, НачатьОбработку);</w:t>
-      </w:r>
-    </w:p>
-    <w:p>
-      <w:pPr>
-        <w:spacing w:line="360" w:lineRule="auto" w:after="80" w:before="0"/>
-        <w:ind w:firstLine="0" w:left="709"/>
-        <w:jc w:val="both"/>
-      </w:pPr>
-      <w:r>
-        <w:rPr>
-          <w:rFonts w:ascii="Times New Roman" w:hAnsi="Times New Roman" w:eastAsia="Times New Roman"/>
-          <w:b w:val="0"/>
-          <w:i w:val="0"/>
-          <w:color w:val="000000"/>
-          <w:sz w:val="28"/>
-        </w:rPr>
-        <w:t>– точки UX типовых форм: МодификацияКонфигурацииПереопределяемый, СобытияФормКлиент.</w:t>
+        <w:t>– API ДО 3: ИнтеграцияС1СДокументооборот3 (ПрерватьОбработку, НачатьОбработку).</w:t>
       </w:r>
     </w:p>
     <w:p>
@@ -620,7 +658,7 @@
           <w:color w:val="000000"/>
           <w:sz w:val="28"/>
         </w:rPr>
-        <w:t>Источник истины для контроля проведения — регистр состояний ДО (не обязательный веб-вызов на каждое проведение).</w:t>
+        <w:t>Источник истины для контроля проведения — регистр состояний ДО (не обязательный веб-вызов на каждое проведение). Типовые модули форм не расширяются.</w:t>
       </w:r>
     </w:p>
     <w:p>
@@ -1067,7 +1105,7 @@
                 <w:color w:val="000000"/>
                 <w:sz w:val="22"/>
               </w:rPr>
-              <w:t>ОМ.нп_КонтрольПроведенияПоСогласованиюДОКлиент</w:t>
+              <w:t>ОМ.нп_КонтрольПроведенияПоСогласованиюДОКлиентСервер</w:t>
             </w:r>
           </w:p>
         </w:tc>
@@ -1094,7 +1132,7 @@
                 <w:color w:val="000000"/>
                 <w:sz w:val="22"/>
               </w:rPr>
-              <w:t>Вопрос подтверждения на форме</w:t>
+              <w:t>Отбор СКД (общие процедуры)</w:t>
             </w:r>
           </w:p>
         </w:tc>
@@ -1151,118 +1189,6 @@
                 <w:sz w:val="22"/>
               </w:rPr>
               <w:t>Кэш настроек и состава групп</w:t>
-            </w:r>
-          </w:p>
-        </w:tc>
-      </w:tr>
-      <w:tr>
-        <w:tc>
-          <w:tcPr>
-            <w:tcW w:type="dxa" w:w="4844"/>
-            <w:tcBorders>
-              <w:top w:val="single" w:sz="8" w:color="000000"/>
-              <w:left w:val="single" w:sz="8" w:color="000000"/>
-              <w:bottom w:val="single" w:sz="8" w:color="000000"/>
-              <w:right w:val="single" w:sz="8" w:color="000000"/>
-            </w:tcBorders>
-          </w:tcPr>
-          <w:p>
-            <w:pPr>
-              <w:jc w:val="left"/>
-            </w:pPr>
-            <w:r/>
-            <w:r>
-              <w:rPr>
-                <w:rFonts w:ascii="Times New Roman" w:hAnsi="Times New Roman" w:eastAsia="Times New Roman"/>
-                <w:b w:val="0"/>
-                <w:i w:val="0"/>
-                <w:color w:val="000000"/>
-                <w:sz w:val="22"/>
-              </w:rPr>
-              <w:t>ОМ.СобытияФормКлиент (&amp;После)</w:t>
-            </w:r>
-          </w:p>
-        </w:tc>
-        <w:tc>
-          <w:tcPr>
-            <w:tcW w:type="dxa" w:w="4844"/>
-            <w:tcBorders>
-              <w:top w:val="single" w:sz="8" w:color="000000"/>
-              <w:left w:val="single" w:sz="8" w:color="000000"/>
-              <w:bottom w:val="single" w:sz="8" w:color="000000"/>
-              <w:right w:val="single" w:sz="8" w:color="000000"/>
-            </w:tcBorders>
-          </w:tcPr>
-          <w:p>
-            <w:pPr>
-              <w:jc w:val="left"/>
-            </w:pPr>
-            <w:r/>
-            <w:r>
-              <w:rPr>
-                <w:rFonts w:ascii="Times New Roman" w:hAnsi="Times New Roman" w:eastAsia="Times New Roman"/>
-                <w:b w:val="0"/>
-                <w:i w:val="0"/>
-                <w:color w:val="000000"/>
-                <w:sz w:val="22"/>
-              </w:rPr>
-              <w:t>Подключение клиентского вопроса</w:t>
-            </w:r>
-          </w:p>
-        </w:tc>
-      </w:tr>
-      <w:tr>
-        <w:tc>
-          <w:tcPr>
-            <w:tcW w:type="dxa" w:w="4844"/>
-            <w:tcBorders>
-              <w:top w:val="single" w:sz="8" w:color="000000"/>
-              <w:left w:val="single" w:sz="8" w:color="000000"/>
-              <w:bottom w:val="single" w:sz="8" w:color="000000"/>
-              <w:right w:val="single" w:sz="8" w:color="000000"/>
-            </w:tcBorders>
-          </w:tcPr>
-          <w:p>
-            <w:pPr>
-              <w:jc w:val="left"/>
-            </w:pPr>
-            <w:r/>
-            <w:r>
-              <w:rPr>
-                <w:rFonts w:ascii="Times New Roman" w:hAnsi="Times New Roman" w:eastAsia="Times New Roman"/>
-                <w:b w:val="0"/>
-                <w:i w:val="0"/>
-                <w:color w:val="000000"/>
-                <w:sz w:val="22"/>
-              </w:rPr>
-              <w:t>ОМ.МодификацияКонфигурацииПереопределяемый (&amp;После)</w:t>
-            </w:r>
-          </w:p>
-        </w:tc>
-        <w:tc>
-          <w:tcPr>
-            <w:tcW w:type="dxa" w:w="4844"/>
-            <w:tcBorders>
-              <w:top w:val="single" w:sz="8" w:color="000000"/>
-              <w:left w:val="single" w:sz="8" w:color="000000"/>
-              <w:bottom w:val="single" w:sz="8" w:color="000000"/>
-              <w:right w:val="single" w:sz="8" w:color="000000"/>
-            </w:tcBorders>
-          </w:tcPr>
-          <w:p>
-            <w:pPr>
-              <w:jc w:val="left"/>
-            </w:pPr>
-            <w:r/>
-            <w:r>
-              <w:rPr>
-                <w:rFonts w:ascii="Times New Roman" w:hAnsi="Times New Roman" w:eastAsia="Times New Roman"/>
-                <w:b w:val="0"/>
-                <w:i w:val="0"/>
-                <w:color w:val="000000"/>
-                <w:sz w:val="22"/>
-              </w:rPr>
-              <w:t>Статус согласования на форме</w:t>
             </w:r>
           </w:p>
         </w:tc>
@@ -1446,7 +1372,7 @@
           <w:color w:val="000000"/>
           <w:sz w:val="28"/>
         </w:rPr>
-        <w:t>1. Форма документа → СобытияФормКлиент (вопрос при существенных изменениях).</w:t>
+        <w:t>1. Запись / проведение → подписка ПередЗаписью нп_КонтрольПроведенияПоДОПередЗаписьюДокумента.</w:t>
       </w:r>
     </w:p>
     <w:p>
@@ -1463,7 +1389,7 @@
           <w:color w:val="000000"/>
           <w:sz w:val="28"/>
         </w:rPr>
-        <w:t>2. Запись объекта → подписка ПередЗаписью нп_КонтрольПроведенияПоДОПередЗаписьюДокумента.</w:t>
+        <w:t>2. ОМ нп_КонтрольПроведенияПоСогласованиюДО: применимость настройки; существенные изменения → Прервать/Начать ДО 3 + сообщение; при проведении — только «Согласован».</w:t>
       </w:r>
     </w:p>
     <w:p>
@@ -1480,24 +1406,7 @@
           <w:color w:val="000000"/>
           <w:sz w:val="28"/>
         </w:rPr>
-        <w:t>3. ОМ нп_КонтрольПроведенияПоСогласованиюДО: применимость настройки; существенные изменения → Прервать/Начать ДО 3; при проведении — только «Согласован».</w:t>
-      </w:r>
-    </w:p>
-    <w:p>
-      <w:pPr>
-        <w:spacing w:line="360" w:lineRule="auto" w:after="80" w:before="0"/>
-        <w:ind w:firstLine="0" w:left="709"/>
-        <w:jc w:val="both"/>
-      </w:pPr>
-      <w:r>
-        <w:rPr>
-          <w:rFonts w:ascii="Times New Roman" w:hAnsi="Times New Roman" w:eastAsia="Times New Roman"/>
-          <w:b w:val="0"/>
-          <w:i w:val="0"/>
-          <w:color w:val="000000"/>
-          <w:sz w:val="28"/>
-        </w:rPr>
-        <w:t>4. Источники данных: РС настроек, РС признаков, РС состояний ДО и связи объектов, API ДО 3.</w:t>
+        <w:t>3. Источники данных: РС настроек, РС признаков, РС состояний ДО и связи объектов, API ДО 3.</w:t>
       </w:r>
     </w:p>
     <w:p>
@@ -1769,7 +1678,7 @@
           <w:color w:val="000000"/>
           <w:sz w:val="28"/>
         </w:rPr>
-        <w:t>При существенных изменениях:</w:t>
+        <w:t>При существенных изменениях (сервер, без вопроса на форме):</w:t>
       </w:r>
     </w:p>
     <w:p>
@@ -1786,7 +1695,7 @@
           <w:color w:val="000000"/>
           <w:sz w:val="28"/>
         </w:rPr>
-        <w:t>1. на форме — вопрос подтверждения;</w:t>
+        <w:t>1. установка признака «требуется пересогласование»;</w:t>
       </w:r>
     </w:p>
     <w:p>
@@ -1803,7 +1712,7 @@
           <w:color w:val="000000"/>
           <w:sz w:val="28"/>
         </w:rPr>
-        <w:t>2. на сервере — установка признака, вызов ДО 3: ПрерватьОбработку → НачатьОбработку;</w:t>
+        <w:t>2. вызов ДО 3: ПрерватьОбработку → НачатьОбработку;</w:t>
       </w:r>
     </w:p>
     <w:p>
@@ -1837,7 +1746,24 @@
           <w:color w:val="000000"/>
           <w:sz w:val="28"/>
         </w:rPr>
-        <w:t>4. провести снова можно только после нового состояния «Согласован».</w:t>
+        <w:t>4. пользователю выводится сообщение о перезапуске согласования;</w:t>
+      </w:r>
+    </w:p>
+    <w:p>
+      <w:pPr>
+        <w:spacing w:line="360" w:lineRule="auto" w:after="80" w:before="0"/>
+        <w:ind w:firstLine="0" w:left="709"/>
+        <w:jc w:val="both"/>
+      </w:pPr>
+      <w:r>
+        <w:rPr>
+          <w:rFonts w:ascii="Times New Roman" w:hAnsi="Times New Roman" w:eastAsia="Times New Roman"/>
+          <w:b w:val="0"/>
+          <w:i w:val="0"/>
+          <w:color w:val="000000"/>
+          <w:sz w:val="28"/>
+        </w:rPr>
+        <w:t>5. провести снова можно только после нового состояния «Согласован».</w:t>
       </w:r>
     </w:p>
     <w:p>
@@ -1871,355 +1797,26 @@
           <w:color w:val="000000"/>
           <w:sz w:val="28"/>
         </w:rPr>
-        <w:t>7. Клиентский и серверный контуры</w:t>
+        <w:t>7. Точка встраивания</w:t>
       </w:r>
     </w:p>
-    <w:tbl>
-      <w:tblPr>
-        <w:tblW w:type="auto" w:w="0"/>
-        <w:jc w:val="center"/>
-        <w:tblLayout w:type="autofit"/>
-        <w:tblLook w:firstColumn="1" w:firstRow="1" w:lastColumn="0" w:lastRow="0" w:noHBand="0" w:noVBand="1" w:val="04A0"/>
-      </w:tblPr>
-      <w:tblGrid>
-        <w:gridCol w:w="3230"/>
-        <w:gridCol w:w="3230"/>
-        <w:gridCol w:w="3230"/>
-      </w:tblGrid>
-      <w:tr>
-        <w:tc>
-          <w:tcPr>
-            <w:tcW w:type="dxa" w:w="3230"/>
-            <w:tcBorders>
-              <w:top w:val="single" w:sz="8" w:color="000000"/>
-              <w:left w:val="single" w:sz="8" w:color="000000"/>
-              <w:bottom w:val="single" w:sz="8" w:color="000000"/>
-              <w:right w:val="single" w:sz="8" w:color="000000"/>
-            </w:tcBorders>
-          </w:tcPr>
-          <w:p>
-            <w:pPr>
-              <w:jc w:val="center"/>
-            </w:pPr>
-            <w:r/>
-            <w:r>
-              <w:rPr>
-                <w:rFonts w:ascii="Times New Roman" w:hAnsi="Times New Roman" w:eastAsia="Times New Roman"/>
-                <w:b/>
-                <w:i w:val="0"/>
-                <w:color w:val="000000"/>
-                <w:sz w:val="24"/>
-              </w:rPr>
-              <w:t>Контур</w:t>
-            </w:r>
-          </w:p>
-        </w:tc>
-        <w:tc>
-          <w:tcPr>
-            <w:tcW w:type="dxa" w:w="3230"/>
-            <w:tcBorders>
-              <w:top w:val="single" w:sz="8" w:color="000000"/>
-              <w:left w:val="single" w:sz="8" w:color="000000"/>
-              <w:bottom w:val="single" w:sz="8" w:color="000000"/>
-              <w:right w:val="single" w:sz="8" w:color="000000"/>
-            </w:tcBorders>
-          </w:tcPr>
-          <w:p>
-            <w:pPr>
-              <w:jc w:val="center"/>
-            </w:pPr>
-            <w:r/>
-            <w:r>
-              <w:rPr>
-                <w:rFonts w:ascii="Times New Roman" w:hAnsi="Times New Roman" w:eastAsia="Times New Roman"/>
-                <w:b/>
-                <w:i w:val="0"/>
-                <w:color w:val="000000"/>
-                <w:sz w:val="24"/>
-              </w:rPr>
-              <w:t>Механизм</w:t>
-            </w:r>
-          </w:p>
-        </w:tc>
-        <w:tc>
-          <w:tcPr>
-            <w:tcW w:type="dxa" w:w="3230"/>
-            <w:tcBorders>
-              <w:top w:val="single" w:sz="8" w:color="000000"/>
-              <w:left w:val="single" w:sz="8" w:color="000000"/>
-              <w:bottom w:val="single" w:sz="8" w:color="000000"/>
-              <w:right w:val="single" w:sz="8" w:color="000000"/>
-            </w:tcBorders>
-          </w:tcPr>
-          <w:p>
-            <w:pPr>
-              <w:jc w:val="center"/>
-            </w:pPr>
-            <w:r/>
-            <w:r>
-              <w:rPr>
-                <w:rFonts w:ascii="Times New Roman" w:hAnsi="Times New Roman" w:eastAsia="Times New Roman"/>
-                <w:b/>
-                <w:i w:val="0"/>
-                <w:color w:val="000000"/>
-                <w:sz w:val="24"/>
-              </w:rPr>
-              <w:t>Задача</w:t>
-            </w:r>
-          </w:p>
-        </w:tc>
-      </w:tr>
-      <w:tr>
-        <w:tc>
-          <w:tcPr>
-            <w:tcW w:type="dxa" w:w="3230"/>
-            <w:tcBorders>
-              <w:top w:val="single" w:sz="8" w:color="000000"/>
-              <w:left w:val="single" w:sz="8" w:color="000000"/>
-              <w:bottom w:val="single" w:sz="8" w:color="000000"/>
-              <w:right w:val="single" w:sz="8" w:color="000000"/>
-            </w:tcBorders>
-          </w:tcPr>
-          <w:p>
-            <w:pPr>
-              <w:jc w:val="left"/>
-            </w:pPr>
-            <w:r/>
-            <w:r>
-              <w:rPr>
-                <w:rFonts w:ascii="Times New Roman" w:hAnsi="Times New Roman" w:eastAsia="Times New Roman"/>
-                <w:b w:val="0"/>
-                <w:i w:val="0"/>
-                <w:color w:val="000000"/>
-                <w:sz w:val="22"/>
-              </w:rPr>
-              <w:t>Клиент</w:t>
-            </w:r>
-          </w:p>
-        </w:tc>
-        <w:tc>
-          <w:tcPr>
-            <w:tcW w:type="dxa" w:w="3230"/>
-            <w:tcBorders>
-              <w:top w:val="single" w:sz="8" w:color="000000"/>
-              <w:left w:val="single" w:sz="8" w:color="000000"/>
-              <w:bottom w:val="single" w:sz="8" w:color="000000"/>
-              <w:right w:val="single" w:sz="8" w:color="000000"/>
-            </w:tcBorders>
-          </w:tcPr>
-          <w:p>
-            <w:pPr>
-              <w:jc w:val="left"/>
-            </w:pPr>
-            <w:r/>
-            <w:r>
-              <w:rPr>
-                <w:rFonts w:ascii="Times New Roman" w:hAnsi="Times New Roman" w:eastAsia="Times New Roman"/>
-                <w:b w:val="0"/>
-                <w:i w:val="0"/>
-                <w:color w:val="000000"/>
-                <w:sz w:val="22"/>
-              </w:rPr>
-              <w:t>СобытияФормКлиент.ПередЗаписью → клиентский ОМ</w:t>
-            </w:r>
-          </w:p>
-        </w:tc>
-        <w:tc>
-          <w:tcPr>
-            <w:tcW w:type="dxa" w:w="3230"/>
-            <w:tcBorders>
-              <w:top w:val="single" w:sz="8" w:color="000000"/>
-              <w:left w:val="single" w:sz="8" w:color="000000"/>
-              <w:bottom w:val="single" w:sz="8" w:color="000000"/>
-              <w:right w:val="single" w:sz="8" w:color="000000"/>
-            </w:tcBorders>
-          </w:tcPr>
-          <w:p>
-            <w:pPr>
-              <w:jc w:val="left"/>
-            </w:pPr>
-            <w:r/>
-            <w:r>
-              <w:rPr>
-                <w:rFonts w:ascii="Times New Roman" w:hAnsi="Times New Roman" w:eastAsia="Times New Roman"/>
-                <w:b w:val="0"/>
-                <w:i w:val="0"/>
-                <w:color w:val="000000"/>
-                <w:sz w:val="22"/>
-              </w:rPr>
-              <w:t>Подтверждение изменений в защищённом окне</w:t>
-            </w:r>
-          </w:p>
-        </w:tc>
-      </w:tr>
-      <w:tr>
-        <w:tc>
-          <w:tcPr>
-            <w:tcW w:type="dxa" w:w="3230"/>
-            <w:tcBorders>
-              <w:top w:val="single" w:sz="8" w:color="000000"/>
-              <w:left w:val="single" w:sz="8" w:color="000000"/>
-              <w:bottom w:val="single" w:sz="8" w:color="000000"/>
-              <w:right w:val="single" w:sz="8" w:color="000000"/>
-            </w:tcBorders>
-          </w:tcPr>
-          <w:p>
-            <w:pPr>
-              <w:jc w:val="left"/>
-            </w:pPr>
-            <w:r/>
-            <w:r>
-              <w:rPr>
-                <w:rFonts w:ascii="Times New Roman" w:hAnsi="Times New Roman" w:eastAsia="Times New Roman"/>
-                <w:b w:val="0"/>
-                <w:i w:val="0"/>
-                <w:color w:val="000000"/>
-                <w:sz w:val="22"/>
-              </w:rPr>
-              <w:t>Сервер</w:t>
-            </w:r>
-          </w:p>
-        </w:tc>
-        <w:tc>
-          <w:tcPr>
-            <w:tcW w:type="dxa" w:w="3230"/>
-            <w:tcBorders>
-              <w:top w:val="single" w:sz="8" w:color="000000"/>
-              <w:left w:val="single" w:sz="8" w:color="000000"/>
-              <w:bottom w:val="single" w:sz="8" w:color="000000"/>
-              <w:right w:val="single" w:sz="8" w:color="000000"/>
-            </w:tcBorders>
-          </w:tcPr>
-          <w:p>
-            <w:pPr>
-              <w:jc w:val="left"/>
-            </w:pPr>
-            <w:r/>
-            <w:r>
-              <w:rPr>
-                <w:rFonts w:ascii="Times New Roman" w:hAnsi="Times New Roman" w:eastAsia="Times New Roman"/>
-                <w:b w:val="0"/>
-                <w:i w:val="0"/>
-                <w:color w:val="000000"/>
-                <w:sz w:val="22"/>
-              </w:rPr>
-              <w:t>Подписка ПередЗаписью на все DocumentObject</w:t>
-            </w:r>
-          </w:p>
-        </w:tc>
-        <w:tc>
-          <w:tcPr>
-            <w:tcW w:type="dxa" w:w="3230"/>
-            <w:tcBorders>
-              <w:top w:val="single" w:sz="8" w:color="000000"/>
-              <w:left w:val="single" w:sz="8" w:color="000000"/>
-              <w:bottom w:val="single" w:sz="8" w:color="000000"/>
-              <w:right w:val="single" w:sz="8" w:color="000000"/>
-            </w:tcBorders>
-          </w:tcPr>
-          <w:p>
-            <w:pPr>
-              <w:jc w:val="left"/>
-            </w:pPr>
-            <w:r/>
-            <w:r>
-              <w:rPr>
-                <w:rFonts w:ascii="Times New Roman" w:hAnsi="Times New Roman" w:eastAsia="Times New Roman"/>
-                <w:b w:val="0"/>
-                <w:i w:val="0"/>
-                <w:color w:val="000000"/>
-                <w:sz w:val="22"/>
-              </w:rPr>
-              <w:t>Гарантированный контроль независимо от формы</w:t>
-            </w:r>
-          </w:p>
-        </w:tc>
-      </w:tr>
-      <w:tr>
-        <w:tc>
-          <w:tcPr>
-            <w:tcW w:type="dxa" w:w="3230"/>
-            <w:tcBorders>
-              <w:top w:val="single" w:sz="8" w:color="000000"/>
-              <w:left w:val="single" w:sz="8" w:color="000000"/>
-              <w:bottom w:val="single" w:sz="8" w:color="000000"/>
-              <w:right w:val="single" w:sz="8" w:color="000000"/>
-            </w:tcBorders>
-          </w:tcPr>
-          <w:p>
-            <w:pPr>
-              <w:jc w:val="left"/>
-            </w:pPr>
-            <w:r/>
-            <w:r>
-              <w:rPr>
-                <w:rFonts w:ascii="Times New Roman" w:hAnsi="Times New Roman" w:eastAsia="Times New Roman"/>
-                <w:b w:val="0"/>
-                <w:i w:val="0"/>
-                <w:color w:val="000000"/>
-                <w:sz w:val="22"/>
-              </w:rPr>
-              <w:t>UX</w:t>
-            </w:r>
-          </w:p>
-        </w:tc>
-        <w:tc>
-          <w:tcPr>
-            <w:tcW w:type="dxa" w:w="3230"/>
-            <w:tcBorders>
-              <w:top w:val="single" w:sz="8" w:color="000000"/>
-              <w:left w:val="single" w:sz="8" w:color="000000"/>
-              <w:bottom w:val="single" w:sz="8" w:color="000000"/>
-              <w:right w:val="single" w:sz="8" w:color="000000"/>
-            </w:tcBorders>
-          </w:tcPr>
-          <w:p>
-            <w:pPr>
-              <w:jc w:val="left"/>
-            </w:pPr>
-            <w:r/>
-            <w:r>
-              <w:rPr>
-                <w:rFonts w:ascii="Times New Roman" w:hAnsi="Times New Roman" w:eastAsia="Times New Roman"/>
-                <w:b w:val="0"/>
-                <w:i w:val="0"/>
-                <w:color w:val="000000"/>
-                <w:sz w:val="22"/>
-              </w:rPr>
-              <w:t>МодификацияКонфигурацииПереопределяемый</w:t>
-            </w:r>
-          </w:p>
-        </w:tc>
-        <w:tc>
-          <w:tcPr>
-            <w:tcW w:type="dxa" w:w="3230"/>
-            <w:tcBorders>
-              <w:top w:val="single" w:sz="8" w:color="000000"/>
-              <w:left w:val="single" w:sz="8" w:color="000000"/>
-              <w:bottom w:val="single" w:sz="8" w:color="000000"/>
-              <w:right w:val="single" w:sz="8" w:color="000000"/>
-            </w:tcBorders>
-          </w:tcPr>
-          <w:p>
-            <w:pPr>
-              <w:jc w:val="left"/>
-            </w:pPr>
-            <w:r/>
-            <w:r>
-              <w:rPr>
-                <w:rFonts w:ascii="Times New Roman" w:hAnsi="Times New Roman" w:eastAsia="Times New Roman"/>
-                <w:b w:val="0"/>
-                <w:i w:val="0"/>
-                <w:color w:val="000000"/>
-                <w:sz w:val="22"/>
-              </w:rPr>
-              <w:t>Вывод статуса согласования на форме</w:t>
-            </w:r>
-          </w:p>
-        </w:tc>
-      </w:tr>
-    </w:tbl>
-    <w:p/>
+    <w:p>
+      <w:pPr>
+        <w:spacing w:line="360" w:lineRule="auto" w:after="120" w:before="0"/>
+        <w:ind w:firstLine="709"/>
+        <w:jc w:val="both"/>
+      </w:pPr>
+      <w:r>
+        <w:rPr>
+          <w:rFonts w:ascii="Times New Roman" w:hAnsi="Times New Roman" w:eastAsia="Times New Roman"/>
+          <w:b w:val="0"/>
+          <w:i w:val="0"/>
+          <w:color w:val="000000"/>
+          <w:sz w:val="28"/>
+        </w:rPr>
+        <w:t>Контроль выполняется только серверной подпиской ПередЗаписью на все DocumentObject — независимо от формы и способа записи. Типовые общие модули конфигурации не расширяются.</w:t>
+      </w:r>
+    </w:p>
     <w:p>
       <w:pPr>
         <w:spacing w:line="360" w:lineRule="auto" w:after="120" w:before="0"/>
@@ -2590,7 +2187,7 @@
           <w:color w:val="000000"/>
           <w:sz w:val="28"/>
         </w:rPr>
-        <w:t>4. Рассинхрон обмена БИД влияет на актуальность статуса на форме; контроль проведения опирается на регистр состояний.</w:t>
+        <w:t>4. Контроль проведения опирается на регистр состояний ДО; рассинхрон обмена БИД может временно давать устаревшее состояние.</w:t>
       </w:r>
     </w:p>
     <w:sectPr>

</xml_diff>

<commit_message>
Rename allowed attributes register to checked attributes checklist.
Align metadata, logic docs, and CFE with re-approval only on listed attributes.

Co-authored-by: Cursor <cursoragent@cursor.com>
</commit_message>
<xml_diff>
--- a/Extensions/нп_КонтрольПроведенияПоДО/docs/Архитектура_решения.docx
+++ b/Extensions/нп_КонтрольПроведенияПоДО/docs/Архитектура_решения.docx
@@ -825,7 +825,7 @@
                 <w:color w:val="000000"/>
                 <w:sz w:val="22"/>
               </w:rPr>
-              <w:t>РС.нп_РазрешенныеРеквизитыПриСогласованииДО</w:t>
+              <w:t>РС.нп_ПроверяемыеРеквизитыПриСогласованииДО</w:t>
             </w:r>
           </w:p>
         </w:tc>
@@ -852,7 +852,7 @@
                 <w:color w:val="000000"/>
                 <w:sz w:val="22"/>
               </w:rPr>
-              <w:t>Белый список реквизитов (изменения без пересогласования)</w:t>
+              <w:t>Список реквизитов, изменение которых требует пересогласования</w:t>
             </w:r>
           </w:p>
         </w:tc>
@@ -1661,7 +1661,7 @@
           <w:color w:val="000000"/>
           <w:sz w:val="28"/>
         </w:rPr>
-        <w:t>Существенные отличия — любые отличия объекта от данных в ИБ по реквизитам шапки, дате и табличным частям, кроме реквизитов из белого списка нп_РазрешенныеРеквизитыПриСогласованииДО. Пустой белый список означает, что любое отличие считается существенным.</w:t>
+        <w:t>Существенные отличия — изменения только по реквизитам из списка нп_ПроверяемыеРеквизитыПриСогласованииДО (шапка, Дата, Номер, колонки ТЧ в формате ИмяТЧ.ИмяРеквизита). Пустой список означает, что пересогласование по отличиям реквизитов не запускается.</w:t>
       </w:r>
     </w:p>
     <w:p>
@@ -2136,7 +2136,7 @@
           <w:color w:val="000000"/>
           <w:sz w:val="28"/>
         </w:rPr>
-        <w:t>1. Неполный белый список приводит к лишним пересогласованиям — список уточняется в эксплуатации.</w:t>
+        <w:t>1. Неполный список проверяемых реквизитов пропускает существенные изменения; лишние записи дают лишние пересогласования — список уточняется в эксплуатации.</w:t>
       </w:r>
     </w:p>
     <w:p>

</xml_diff>